<commit_message>
Web Dev: swap project challenge complete
</commit_message>
<xml_diff>
--- a/IT Security Awareness/Week7/week7Essay.docx
+++ b/IT Security Awareness/Week7/week7Essay.docx
@@ -1,16 +1,57 @@
 
 <file path=word/document.xml><?xml version="1.0" encoding="utf-8"?>
-<w:document xmlns:wpc="http://schemas.microsoft.com/office/word/2010/wordprocessingCanvas" xmlns:mc="http://schemas.openxmlformats.org/markup-compatibility/2006" xmlns:o="urn:schemas-microsoft-com:office:office" xmlns:r="http://schemas.openxmlformats.org/officeDocument/2006/relationships" xmlns:m="http://schemas.openxmlformats.org/officeDocument/2006/math" xmlns:v="urn:schemas-microsoft-com:vml" xmlns:wp14="http://schemas.microsoft.com/office/word/2010/wordprocessingDrawing" xmlns:wp="http://schemas.openxmlformats.org/drawingml/2006/wordprocessingDrawing" xmlns:w10="urn:schemas-microsoft-com:office:word" xmlns:w="http://schemas.openxmlformats.org/wordprocessingml/2006/main" xmlns:w14="http://schemas.microsoft.com/office/word/2010/wordml" xmlns:w15="http://schemas.microsoft.com/office/word/2012/wordml" xmlns:wpg="http://schemas.microsoft.com/office/word/2010/wordprocessingGroup" xmlns:wpi="http://schemas.microsoft.com/office/word/2010/wordprocessingInk" xmlns:wne="http://schemas.microsoft.com/office/word/2006/wordml" xmlns:wps="http://schemas.microsoft.com/office/word/2010/wordprocessingShape" xmlns:w16se="http://schemas.microsoft.com/office/word/2015/wordml/symex" xmlns:w16cid="http://schemas.microsoft.com/office/word/2016/wordml/cid" xmlns:w16="http://schemas.microsoft.com/office/word/2018/wordml" xmlns:w16cex="http://schemas.microsoft.com/office/word/2018/wordml/cex" xmlns:w16sdtdh="http://schemas.microsoft.com/office/word/2020/wordml/sdtdatahash" xmlns:w16sdtfl="http://schemas.microsoft.com/office/word/2024/wordml/sdtformatlock" mc:Ignorable="w14 w15 wp14 w16se w16cid w16 w16cex w16sdtdh w16sdtfl">
+<w:document xmlns:o="urn:schemas-microsoft-com:office:office" xmlns:r="http://schemas.openxmlformats.org/officeDocument/2006/relationships" xmlns:v="urn:schemas-microsoft-com:vml" xmlns:w="http://schemas.openxmlformats.org/wordprocessingml/2006/main" xmlns:w10="urn:schemas-microsoft-com:office:word" xmlns:wp="http://schemas.openxmlformats.org/drawingml/2006/wordprocessingDrawing" xmlns:pic="http://schemas.openxmlformats.org/drawingml/2006/picture" xmlns:wps="http://schemas.microsoft.com/office/word/2010/wordprocessingShape" xmlns:wpg="http://schemas.microsoft.com/office/word/2010/wordprocessingGroup" xmlns:mc="http://schemas.openxmlformats.org/markup-compatibility/2006" xmlns:wp14="http://schemas.microsoft.com/office/word/2010/wordprocessingDrawing" xmlns:w14="http://schemas.microsoft.com/office/word/2010/wordml" xmlns:w15="http://schemas.microsoft.com/office/word/2012/wordml" mc:Ignorable="w14 wp14 w15">
   <w:body>
     <w:p>
       <w:pPr>
         <w:pStyle w:val="Normal"/>
-        <w:spacing w:before="0" w:beforeAutospacing="off" w:after="322" w:afterAutospacing="off"/>
+        <w:spacing w:beforeAutospacing="0" w:before="0" w:afterAutospacing="0" w:after="322"/>
+        <w:rPr>
+          <w:rFonts w:ascii="Times New Roman" w:hAnsi="Times New Roman" w:eastAsia="Times New Roman" w:cs="Times New Roman"/>
+          <w:sz w:val="24"/>
+          <w:szCs w:val="24"/>
+          <w:lang w:val="en-US"/>
+        </w:rPr>
       </w:pPr>
       <w:r>
         <w:rPr>
+          <w:rFonts w:eastAsia="Times New Roman" w:cs="Times New Roman"/>
+          <w:sz w:val="24"/>
+          <w:szCs w:val="24"/>
+          <w:lang w:val="en-US"/>
+        </w:rPr>
+        <w:t>Link: https://www.techradar.com/computing/software/californias-age-verification-law-is-proving-controversial-heres-what-you-need-to-know-and-why-some-linux-distros-are-in-the-firing-line</w:t>
+      </w:r>
+    </w:p>
+    <w:p>
+      <w:pPr>
+        <w:pStyle w:val="Normal"/>
+        <w:spacing w:beforeAutospacing="0" w:before="0" w:afterAutospacing="0" w:after="322"/>
+        <w:rPr>
           <w:rFonts w:ascii="Times New Roman" w:hAnsi="Times New Roman" w:eastAsia="Times New Roman" w:cs="Times New Roman"/>
-          <w:noProof w:val="0"/>
+          <w:sz w:val="24"/>
+          <w:szCs w:val="24"/>
+          <w:lang w:val="en-US"/>
+        </w:rPr>
+      </w:pPr>
+      <w:r>
+        <w:rPr>
+          <w:rFonts w:eastAsia="Times New Roman" w:cs="Times New Roman"/>
+          <w:sz w:val="24"/>
+          <w:szCs w:val="24"/>
+          <w:lang w:val="en-US"/>
+        </w:rPr>
+      </w:r>
+    </w:p>
+    <w:p>
+      <w:pPr>
+        <w:pStyle w:val="Normal"/>
+        <w:spacing w:beforeAutospacing="0" w:before="0" w:afterAutospacing="0" w:after="322"/>
+        <w:rPr/>
+      </w:pPr>
+      <w:r>
+        <w:rPr>
+          <w:rFonts w:eastAsia="Times New Roman" w:cs="Times New Roman"/>
           <w:sz w:val="24"/>
           <w:szCs w:val="24"/>
           <w:lang w:val="en-US"/>
@@ -19,10 +60,9 @@
       </w:r>
       <w:r>
         <w:rPr>
-          <w:rFonts w:ascii="Times New Roman" w:hAnsi="Times New Roman" w:eastAsia="Times New Roman" w:cs="Times New Roman"/>
-          <w:i w:val="1"/>
-          <w:iCs w:val="1"/>
-          <w:noProof w:val="0"/>
+          <w:rFonts w:eastAsia="Times New Roman" w:cs="Times New Roman"/>
+          <w:i/>
+          <w:iCs/>
           <w:sz w:val="24"/>
           <w:szCs w:val="24"/>
           <w:lang w:val="en-US"/>
@@ -31,55 +71,66 @@
       </w:r>
       <w:r>
         <w:rPr>
-          <w:rFonts w:ascii="Times New Roman" w:hAnsi="Times New Roman" w:eastAsia="Times New Roman" w:cs="Times New Roman"/>
-          <w:noProof w:val="0"/>
+          <w:rFonts w:eastAsia="Times New Roman" w:cs="Times New Roman"/>
           <w:sz w:val="24"/>
           <w:szCs w:val="24"/>
           <w:lang w:val="en-US"/>
         </w:rPr>
-        <w:t xml:space="preserve">, the law, set to take effect January 1, 2027, will require all operating system providers to verify user’s ages during </w:t>
+        <w:t xml:space="preserve">, the law </w:t>
       </w:r>
       <w:r>
         <w:rPr>
-          <w:rFonts w:ascii="Times New Roman" w:hAnsi="Times New Roman" w:eastAsia="Times New Roman" w:cs="Times New Roman"/>
-          <w:noProof w:val="0"/>
+          <w:rFonts w:eastAsia="Times New Roman" w:cs="Times New Roman"/>
           <w:sz w:val="24"/>
           <w:szCs w:val="24"/>
           <w:lang w:val="en-US"/>
         </w:rPr>
-        <w:t>initial</w:t>
+        <w:t>is</w:t>
       </w:r>
       <w:r>
         <w:rPr>
-          <w:rFonts w:ascii="Times New Roman" w:hAnsi="Times New Roman" w:eastAsia="Times New Roman" w:cs="Times New Roman"/>
-          <w:noProof w:val="0"/>
+          <w:rFonts w:eastAsia="Times New Roman" w:cs="Times New Roman"/>
           <w:sz w:val="24"/>
           <w:szCs w:val="24"/>
           <w:lang w:val="en-US"/>
         </w:rPr>
-        <w:t xml:space="preserve"> OS setup.</w:t>
+        <w:t xml:space="preserve"> set to take effect January 1, 2027, </w:t>
+      </w:r>
+      <w:r>
+        <w:rPr>
+          <w:rFonts w:eastAsia="Times New Roman" w:cs="Times New Roman"/>
+          <w:sz w:val="24"/>
+          <w:szCs w:val="24"/>
+          <w:lang w:val="en-US"/>
+        </w:rPr>
+        <w:t xml:space="preserve">and </w:t>
+      </w:r>
+      <w:r>
+        <w:rPr>
+          <w:rFonts w:eastAsia="Times New Roman" w:cs="Times New Roman"/>
+          <w:sz w:val="24"/>
+          <w:szCs w:val="24"/>
+          <w:lang w:val="en-US"/>
+        </w:rPr>
+        <w:t xml:space="preserve">will require all operating system providers to verify user’s ages during initial OS setup. </w:t>
+      </w:r>
+      <w:r>
+        <w:rPr>
+          <w:rFonts w:eastAsia="Times New Roman" w:cs="Times New Roman"/>
+          <w:sz w:val="24"/>
+          <w:szCs w:val="24"/>
+          <w:lang w:val="en-US"/>
+        </w:rPr>
+        <w:t xml:space="preserve">Not only is there age verification, but OS developers are also supposed to transmit the age data with an API to any app developers running on the OS. Specifically, this means the users will be categorized into four age buckets: under 13, 13-15, 16-17, and 18 or older. What this means is that developers will be responsible for blocking certain users from certain types of applications, software, content, etc. </w:t>
+        <w:br/>
       </w:r>
     </w:p>
     <w:p>
       <w:pPr>
         <w:pStyle w:val="Normal"/>
-        <w:spacing w:before="0" w:beforeAutospacing="off" w:after="322" w:afterAutospacing="off"/>
+        <w:spacing w:beforeAutospacing="0" w:before="0" w:afterAutospacing="0" w:after="322"/>
         <w:rPr>
           <w:rFonts w:ascii="Times New Roman" w:hAnsi="Times New Roman" w:eastAsia="Times New Roman" w:cs="Times New Roman"/>
-          <w:noProof w:val="0"/>
-          <w:sz w:val="24"/>
-          <w:szCs w:val="24"/>
-          <w:lang w:val="en-US"/>
-        </w:rPr>
-      </w:pPr>
-    </w:p>
-    <w:p>
-      <w:pPr>
-        <w:pStyle w:val="Normal"/>
-        <w:spacing w:before="0" w:beforeAutospacing="off" w:after="322" w:afterAutospacing="off"/>
-        <w:rPr>
-          <w:rFonts w:ascii="Times New Roman" w:hAnsi="Times New Roman" w:eastAsia="Times New Roman" w:cs="Times New Roman"/>
-          <w:noProof w:val="0"/>
           <w:sz w:val="24"/>
           <w:szCs w:val="24"/>
           <w:lang w:val="en-US"/>
@@ -87,50 +138,137 @@
       </w:pPr>
       <w:r>
         <w:rPr>
-          <w:rFonts w:ascii="Times New Roman" w:hAnsi="Times New Roman" w:eastAsia="Times New Roman" w:cs="Times New Roman"/>
-          <w:noProof w:val="0"/>
+          <w:rFonts w:eastAsia="Times New Roman" w:cs="Times New Roman"/>
           <w:sz w:val="24"/>
           <w:szCs w:val="24"/>
           <w:lang w:val="en-US"/>
         </w:rPr>
-        <w:t>https://www.techradar.com/computing/software/californias-age-verification-law-is-proving-controversial-heres-what-you-need-to-know-and-why-some-linux-distros-are-in-the-firing-line</w:t>
+        <w:t xml:space="preserve">While many folks are trying to downplay its seriousness, pointing towards the fact that this verification process is only a self-reported age check with no photo ID, I think there is decent precedent to show that we as consumers shouldn’t be so willing to hand over our decision-making faculties to the government or big corporations. </w:t>
+      </w:r>
+      <w:r>
+        <w:rPr>
+          <w:rFonts w:eastAsia="Times New Roman" w:cs="Times New Roman"/>
+          <w:sz w:val="24"/>
+          <w:szCs w:val="24"/>
+          <w:lang w:val="en-US"/>
+        </w:rPr>
+        <w:t>Lots of legislation gets passed under the guise of “save the children”, but ultimately gets used against every day people.</w:t>
       </w:r>
     </w:p>
     <w:p>
       <w:pPr>
-        <w:spacing w:before="0" w:beforeAutospacing="off" w:after="322" w:afterAutospacing="off"/>
+        <w:pStyle w:val="Normal"/>
+        <w:spacing w:beforeAutospacing="0" w:before="0" w:afterAutospacing="0" w:after="322"/>
+        <w:rPr>
+          <w:rFonts w:ascii="Times New Roman" w:hAnsi="Times New Roman" w:eastAsia="Times New Roman" w:cs="Times New Roman"/>
+          <w:sz w:val="24"/>
+          <w:szCs w:val="24"/>
+          <w:lang w:val="en-US"/>
+        </w:rPr>
       </w:pPr>
+      <w:r>
+        <w:rPr>
+          <w:rFonts w:eastAsia="Times New Roman" w:cs="Times New Roman"/>
+          <w:sz w:val="24"/>
+          <w:szCs w:val="24"/>
+          <w:lang w:val="en-US"/>
+        </w:rPr>
+      </w:r>
     </w:p>
     <w:p>
       <w:pPr>
-        <w:spacing w:before="0" w:beforeAutospacing="off" w:after="322" w:afterAutospacing="off"/>
+        <w:pStyle w:val="Normal"/>
+        <w:spacing w:beforeAutospacing="0" w:before="0" w:afterAutospacing="0" w:after="322"/>
+        <w:rPr>
+          <w:rFonts w:ascii="Times New Roman" w:hAnsi="Times New Roman" w:eastAsia="Times New Roman" w:cs="Times New Roman"/>
+          <w:sz w:val="24"/>
+          <w:szCs w:val="24"/>
+          <w:lang w:val="en-US"/>
+        </w:rPr>
       </w:pPr>
+      <w:r>
+        <w:rPr/>
+      </w:r>
     </w:p>
     <w:p>
       <w:pPr>
-        <w:spacing w:before="0" w:beforeAutospacing="off" w:after="322" w:afterAutospacing="off"/>
+        <w:pStyle w:val="Normal"/>
+        <w:spacing w:beforeAutospacing="0" w:before="0" w:afterAutospacing="0" w:after="322"/>
+        <w:rPr/>
       </w:pPr>
+      <w:r>
+        <w:rPr/>
+      </w:r>
+    </w:p>
+    <w:p>
+      <w:pPr>
+        <w:pStyle w:val="Normal"/>
+        <w:spacing w:beforeAutospacing="0" w:before="0" w:afterAutospacing="0" w:after="322"/>
+        <w:rPr/>
+      </w:pPr>
+      <w:r>
+        <w:rPr/>
+      </w:r>
+    </w:p>
+    <w:p>
+      <w:pPr>
+        <w:pStyle w:val="Normal"/>
+        <w:spacing w:beforeAutospacing="0" w:before="0" w:afterAutospacing="0" w:after="322"/>
+        <w:rPr/>
+      </w:pPr>
+      <w:r>
+        <w:rPr/>
+      </w:r>
     </w:p>
     <w:sectPr>
-      <w:pgSz w:w="12240" w:h="15840" w:orient="portrait"/>
-      <w:pgMar w:top="1440" w:right="1440" w:bottom="1440" w:left="1440" w:header="720" w:footer="720" w:gutter="0"/>
-      <w:cols w:space="720"/>
-      <w:docGrid w:linePitch="360"/>
-      <w:headerReference w:type="default" r:id="Rc29b1a513fd949c7"/>
-      <w:footerReference w:type="default" r:id="R52ca4437f1484fd7"/>
+      <w:headerReference w:type="even" r:id="rId2"/>
+      <w:headerReference w:type="default" r:id="rId3"/>
+      <w:headerReference w:type="first" r:id="rId4"/>
+      <w:footerReference w:type="even" r:id="rId5"/>
+      <w:footerReference w:type="default" r:id="rId6"/>
+      <w:footerReference w:type="first" r:id="rId7"/>
+      <w:type w:val="nextPage"/>
+      <w:pgSz w:w="12240" w:h="15840"/>
+      <w:pgMar w:left="1440" w:right="1440" w:gutter="0" w:header="720" w:top="1440" w:footer="720" w:bottom="1440"/>
+      <w:pgNumType w:fmt="decimal"/>
+      <w:formProt w:val="false"/>
+      <w:textDirection w:val="lrTb"/>
+      <w:docGrid w:type="default" w:linePitch="360" w:charSpace="0"/>
     </w:sectPr>
   </w:body>
 </w:document>
 </file>
 
-<file path=word/footer.xml><?xml version="1.0" encoding="utf-8"?>
-<w:ftr xmlns:w14="http://schemas.microsoft.com/office/word/2010/wordml" xmlns:w="http://schemas.openxmlformats.org/wordprocessingml/2006/main">
+<file path=word/footer1.xml><?xml version="1.0" encoding="utf-8"?>
+<w:ftr xmlns:o="urn:schemas-microsoft-com:office:office" xmlns:r="http://schemas.openxmlformats.org/officeDocument/2006/relationships" xmlns:v="urn:schemas-microsoft-com:vml" xmlns:w="http://schemas.openxmlformats.org/wordprocessingml/2006/main" xmlns:w10="urn:schemas-microsoft-com:office:word" xmlns:wp="http://schemas.openxmlformats.org/drawingml/2006/wordprocessingDrawing" xmlns:pic="http://schemas.openxmlformats.org/drawingml/2006/picture" xmlns:wps="http://schemas.microsoft.com/office/word/2010/wordprocessingShape" xmlns:wpg="http://schemas.microsoft.com/office/word/2010/wordprocessingGroup" xmlns:mc="http://schemas.openxmlformats.org/markup-compatibility/2006" xmlns:wp14="http://schemas.microsoft.com/office/word/2010/wordprocessingDrawing" xmlns:w14="http://schemas.microsoft.com/office/word/2010/wordml" xmlns:w15="http://schemas.microsoft.com/office/word/2012/wordml" mc:Ignorable="w14 wp14 w15">
+  <w:p>
+    <w:pPr>
+      <w:pStyle w:val="Footer"/>
+      <w:rPr/>
+    </w:pPr>
+    <w:r>
+      <w:rPr/>
+    </w:r>
+  </w:p>
+</w:ftr>
+</file>
+
+<file path=word/footer2.xml><?xml version="1.0" encoding="utf-8"?>
+<w:ftr xmlns:o="urn:schemas-microsoft-com:office:office" xmlns:r="http://schemas.openxmlformats.org/officeDocument/2006/relationships" xmlns:v="urn:schemas-microsoft-com:vml" xmlns:w="http://schemas.openxmlformats.org/wordprocessingml/2006/main" xmlns:w10="urn:schemas-microsoft-com:office:word" xmlns:wp="http://schemas.openxmlformats.org/drawingml/2006/wordprocessingDrawing" xmlns:pic="http://schemas.openxmlformats.org/drawingml/2006/picture" xmlns:wps="http://schemas.microsoft.com/office/word/2010/wordprocessingShape" xmlns:wpg="http://schemas.microsoft.com/office/word/2010/wordprocessingGroup" xmlns:mc="http://schemas.openxmlformats.org/markup-compatibility/2006" xmlns:wp14="http://schemas.microsoft.com/office/word/2010/wordprocessingDrawing" xmlns:w14="http://schemas.microsoft.com/office/word/2010/wordml" xmlns:w15="http://schemas.microsoft.com/office/word/2012/wordml" mc:Ignorable="w14 wp14 w15">
   <w:tbl>
     <w:tblPr>
       <w:tblStyle w:val="TableNormal"/>
-      <w:bidiVisual w:val="0"/>
-      <w:tblW w:w="0" w:type="auto"/>
-      <w:tblLook w:val="06A0" w:firstRow="1" w:lastRow="0" w:firstColumn="1" w:lastColumn="0" w:noHBand="1" w:noVBand="1"/>
+      <w:tblW w:w="9360" w:type="dxa"/>
+      <w:jc w:val="start"/>
+      <w:tblInd w:w="0" w:type="dxa"/>
+      <w:tblLayout w:type="fixed"/>
+      <w:tblCellMar>
+        <w:top w:w="0" w:type="dxa"/>
+        <w:start w:w="108" w:type="dxa"/>
+        <w:bottom w:w="0" w:type="dxa"/>
+        <w:end w:w="108" w:type="dxa"/>
+      </w:tblCellMar>
+      <w:tblLook w:val="06a0" w:noHBand="1" w:noVBand="1" w:firstColumn="1" w:lastRow="0" w:lastColumn="0" w:firstRow="1"/>
     </w:tblPr>
     <w:tblGrid>
       <w:gridCol w:w="3120"/>
@@ -139,57 +277,140 @@
     </w:tblGrid>
     <w:tr>
       <w:trPr>
-        <w:trHeight w:val="300"/>
+        <w:trHeight w:val="300" w:hRule="atLeast"/>
       </w:trPr>
       <w:tc>
         <w:tcPr>
           <w:tcW w:w="3120" w:type="dxa"/>
-          <w:tcMar/>
+          <w:tcBorders/>
         </w:tcPr>
         <w:p>
           <w:pPr>
             <w:pStyle w:val="Header"/>
+            <w:widowControl/>
             <w:bidi w:val="0"/>
-            <w:ind w:left="-115"/>
-            <w:jc w:val="left"/>
+            <w:spacing w:before="0" w:after="0"/>
+            <w:ind w:start="-115"/>
+            <w:jc w:val="start"/>
+            <w:rPr>
+              <w:rFonts w:ascii="Times New Roman" w:hAnsi="Times New Roman" w:eastAsia="" w:cs=""/>
+              <w:kern w:val="0"/>
+              <w:sz w:val="24"/>
+              <w:szCs w:val="24"/>
+              <w:lang w:val="en-US" w:eastAsia="ja-JP" w:bidi="ar-SA"/>
+            </w:rPr>
           </w:pPr>
+          <w:r>
+            <w:rPr>
+              <w:rFonts w:eastAsia="" w:cs=""/>
+              <w:kern w:val="0"/>
+              <w:sz w:val="24"/>
+              <w:szCs w:val="24"/>
+              <w:lang w:val="en-US" w:eastAsia="ja-JP" w:bidi="ar-SA"/>
+            </w:rPr>
+          </w:r>
         </w:p>
       </w:tc>
       <w:tc>
         <w:tcPr>
           <w:tcW w:w="3120" w:type="dxa"/>
-          <w:tcMar/>
+          <w:tcBorders/>
         </w:tcPr>
         <w:p>
           <w:pPr>
             <w:pStyle w:val="Header"/>
+            <w:widowControl/>
             <w:bidi w:val="0"/>
+            <w:spacing w:before="0" w:after="0"/>
             <w:jc w:val="center"/>
+            <w:rPr>
+              <w:rFonts w:ascii="Times New Roman" w:hAnsi="Times New Roman" w:eastAsia="" w:cs=""/>
+              <w:kern w:val="0"/>
+              <w:sz w:val="24"/>
+              <w:szCs w:val="24"/>
+              <w:lang w:val="en-US" w:eastAsia="ja-JP" w:bidi="ar-SA"/>
+            </w:rPr>
           </w:pPr>
+          <w:r>
+            <w:rPr>
+              <w:rFonts w:eastAsia="" w:cs=""/>
+              <w:kern w:val="0"/>
+              <w:sz w:val="24"/>
+              <w:szCs w:val="24"/>
+              <w:lang w:val="en-US" w:eastAsia="ja-JP" w:bidi="ar-SA"/>
+            </w:rPr>
+          </w:r>
         </w:p>
       </w:tc>
       <w:tc>
         <w:tcPr>
           <w:tcW w:w="3120" w:type="dxa"/>
-          <w:tcMar/>
+          <w:tcBorders/>
         </w:tcPr>
         <w:p>
           <w:pPr>
             <w:pStyle w:val="Header"/>
+            <w:widowControl/>
             <w:bidi w:val="0"/>
-            <w:ind w:right="-115"/>
-            <w:jc w:val="right"/>
+            <w:spacing w:before="0" w:after="0"/>
+            <w:ind w:end="-115"/>
+            <w:jc w:val="end"/>
+            <w:rPr>
+              <w:rFonts w:ascii="Times New Roman" w:hAnsi="Times New Roman" w:eastAsia="" w:cs=""/>
+              <w:kern w:val="0"/>
+              <w:sz w:val="24"/>
+              <w:szCs w:val="24"/>
+              <w:lang w:val="en-US" w:eastAsia="ja-JP" w:bidi="ar-SA"/>
+            </w:rPr>
           </w:pPr>
           <w:r>
+            <w:rPr>
+              <w:rFonts w:eastAsia="" w:cs=""/>
+              <w:kern w:val="0"/>
+              <w:sz w:val="24"/>
+              <w:szCs w:val="24"/>
+              <w:lang w:val="en-US" w:eastAsia="ja-JP" w:bidi="ar-SA"/>
+            </w:rPr>
             <w:fldChar w:fldCharType="begin"/>
           </w:r>
           <w:r>
-            <w:instrText xml:space="preserve">PAGE</w:instrText>
-          </w:r>
-          <w:r>
+            <w:rPr>
+              <w:sz w:val="24"/>
+              <w:kern w:val="0"/>
+              <w:szCs w:val="24"/>
+              <w:rFonts w:eastAsia="" w:cs=""/>
+              <w:lang w:val="en-US" w:eastAsia="ja-JP" w:bidi="ar-SA"/>
+            </w:rPr>
+            <w:instrText xml:space="preserve"> PAGE </w:instrText>
+          </w:r>
+          <w:r>
+            <w:rPr>
+              <w:sz w:val="24"/>
+              <w:kern w:val="0"/>
+              <w:szCs w:val="24"/>
+              <w:rFonts w:eastAsia="" w:cs=""/>
+              <w:lang w:val="en-US" w:eastAsia="ja-JP" w:bidi="ar-SA"/>
+            </w:rPr>
             <w:fldChar w:fldCharType="separate"/>
           </w:r>
           <w:r>
+            <w:rPr>
+              <w:sz w:val="24"/>
+              <w:kern w:val="0"/>
+              <w:szCs w:val="24"/>
+              <w:rFonts w:eastAsia="" w:cs=""/>
+              <w:lang w:val="en-US" w:eastAsia="ja-JP" w:bidi="ar-SA"/>
+            </w:rPr>
+            <w:t>1</w:t>
+          </w:r>
+          <w:r>
+            <w:rPr>
+              <w:sz w:val="24"/>
+              <w:kern w:val="0"/>
+              <w:szCs w:val="24"/>
+              <w:rFonts w:eastAsia="" w:cs=""/>
+              <w:lang w:val="en-US" w:eastAsia="ja-JP" w:bidi="ar-SA"/>
+            </w:rPr>
             <w:fldChar w:fldCharType="end"/>
           </w:r>
         </w:p>
@@ -200,19 +421,31 @@
     <w:pPr>
       <w:pStyle w:val="Footer"/>
       <w:bidi w:val="0"/>
+      <w:rPr/>
     </w:pPr>
+    <w:r>
+      <w:rPr/>
+    </w:r>
   </w:p>
 </w:ftr>
 </file>
 
-<file path=word/header.xml><?xml version="1.0" encoding="utf-8"?>
-<w:hdr xmlns:w14="http://schemas.microsoft.com/office/word/2010/wordml" xmlns:w="http://schemas.openxmlformats.org/wordprocessingml/2006/main">
+<file path=word/footer3.xml><?xml version="1.0" encoding="utf-8"?>
+<w:ftr xmlns:o="urn:schemas-microsoft-com:office:office" xmlns:r="http://schemas.openxmlformats.org/officeDocument/2006/relationships" xmlns:v="urn:schemas-microsoft-com:vml" xmlns:w="http://schemas.openxmlformats.org/wordprocessingml/2006/main" xmlns:w10="urn:schemas-microsoft-com:office:word" xmlns:wp="http://schemas.openxmlformats.org/drawingml/2006/wordprocessingDrawing" xmlns:pic="http://schemas.openxmlformats.org/drawingml/2006/picture" xmlns:wps="http://schemas.microsoft.com/office/word/2010/wordprocessingShape" xmlns:wpg="http://schemas.microsoft.com/office/word/2010/wordprocessingGroup" xmlns:mc="http://schemas.openxmlformats.org/markup-compatibility/2006" xmlns:wp14="http://schemas.microsoft.com/office/word/2010/wordprocessingDrawing" xmlns:w14="http://schemas.microsoft.com/office/word/2010/wordml" xmlns:w15="http://schemas.microsoft.com/office/word/2012/wordml" mc:Ignorable="w14 wp14 w15">
   <w:tbl>
     <w:tblPr>
       <w:tblStyle w:val="TableNormal"/>
-      <w:bidiVisual w:val="0"/>
-      <w:tblW w:w="0" w:type="auto"/>
-      <w:tblLook w:val="06A0" w:firstRow="1" w:lastRow="0" w:firstColumn="1" w:lastColumn="0" w:noHBand="1" w:noVBand="1"/>
+      <w:tblW w:w="9360" w:type="dxa"/>
+      <w:jc w:val="start"/>
+      <w:tblInd w:w="0" w:type="dxa"/>
+      <w:tblLayout w:type="fixed"/>
+      <w:tblCellMar>
+        <w:top w:w="0" w:type="dxa"/>
+        <w:start w:w="108" w:type="dxa"/>
+        <w:bottom w:w="0" w:type="dxa"/>
+        <w:end w:w="108" w:type="dxa"/>
+      </w:tblCellMar>
+      <w:tblLook w:val="06a0" w:noHBand="1" w:noVBand="1" w:firstColumn="1" w:lastRow="0" w:lastColumn="0" w:firstRow="1"/>
     </w:tblPr>
     <w:tblGrid>
       <w:gridCol w:w="3120"/>
@@ -221,63 +454,320 @@
     </w:tblGrid>
     <w:tr>
       <w:trPr>
-        <w:trHeight w:val="300"/>
+        <w:trHeight w:val="300" w:hRule="atLeast"/>
       </w:trPr>
       <w:tc>
         <w:tcPr>
           <w:tcW w:w="3120" w:type="dxa"/>
-          <w:tcMar/>
+          <w:tcBorders/>
         </w:tcPr>
         <w:p>
           <w:pPr>
             <w:pStyle w:val="Header"/>
+            <w:widowControl/>
             <w:bidi w:val="0"/>
-            <w:ind w:left="-115"/>
-            <w:jc w:val="left"/>
+            <w:spacing w:before="0" w:after="0"/>
+            <w:ind w:start="-115"/>
+            <w:jc w:val="start"/>
+            <w:rPr>
+              <w:rFonts w:ascii="Times New Roman" w:hAnsi="Times New Roman" w:eastAsia="" w:cs=""/>
+              <w:kern w:val="0"/>
+              <w:sz w:val="24"/>
+              <w:szCs w:val="24"/>
+              <w:lang w:val="en-US" w:eastAsia="ja-JP" w:bidi="ar-SA"/>
+            </w:rPr>
           </w:pPr>
           <w:r>
-            <w:rPr/>
-            <w:t>John Zimmerman</w:t>
-          </w:r>
-        </w:p>
-        <w:p>
-          <w:pPr>
-            <w:pStyle w:val="Header"/>
-            <w:bidi w:val="0"/>
-            <w:ind w:left="-115"/>
-            <w:jc w:val="left"/>
-          </w:pPr>
-          <w:r>
-            <w:rPr/>
-            <w:t>IT Security Awareness</w:t>
+            <w:rPr>
+              <w:rFonts w:eastAsia="" w:cs=""/>
+              <w:kern w:val="0"/>
+              <w:sz w:val="24"/>
+              <w:szCs w:val="24"/>
+              <w:lang w:val="en-US" w:eastAsia="ja-JP" w:bidi="ar-SA"/>
+            </w:rPr>
           </w:r>
         </w:p>
       </w:tc>
       <w:tc>
         <w:tcPr>
           <w:tcW w:w="3120" w:type="dxa"/>
-          <w:tcMar/>
+          <w:tcBorders/>
         </w:tcPr>
         <w:p>
           <w:pPr>
             <w:pStyle w:val="Header"/>
+            <w:widowControl/>
             <w:bidi w:val="0"/>
+            <w:spacing w:before="0" w:after="0"/>
             <w:jc w:val="center"/>
+            <w:rPr>
+              <w:rFonts w:ascii="Times New Roman" w:hAnsi="Times New Roman" w:eastAsia="" w:cs=""/>
+              <w:kern w:val="0"/>
+              <w:sz w:val="24"/>
+              <w:szCs w:val="24"/>
+              <w:lang w:val="en-US" w:eastAsia="ja-JP" w:bidi="ar-SA"/>
+            </w:rPr>
           </w:pPr>
+          <w:r>
+            <w:rPr>
+              <w:rFonts w:eastAsia="" w:cs=""/>
+              <w:kern w:val="0"/>
+              <w:sz w:val="24"/>
+              <w:szCs w:val="24"/>
+              <w:lang w:val="en-US" w:eastAsia="ja-JP" w:bidi="ar-SA"/>
+            </w:rPr>
+          </w:r>
         </w:p>
       </w:tc>
       <w:tc>
         <w:tcPr>
           <w:tcW w:w="3120" w:type="dxa"/>
-          <w:tcMar/>
+          <w:tcBorders/>
         </w:tcPr>
         <w:p>
           <w:pPr>
             <w:pStyle w:val="Header"/>
+            <w:widowControl/>
             <w:bidi w:val="0"/>
-            <w:ind w:right="-115"/>
-            <w:jc w:val="right"/>
+            <w:spacing w:before="0" w:after="0"/>
+            <w:ind w:end="-115"/>
+            <w:jc w:val="end"/>
+            <w:rPr>
+              <w:rFonts w:ascii="Times New Roman" w:hAnsi="Times New Roman" w:eastAsia="" w:cs=""/>
+              <w:kern w:val="0"/>
+              <w:sz w:val="24"/>
+              <w:szCs w:val="24"/>
+              <w:lang w:val="en-US" w:eastAsia="ja-JP" w:bidi="ar-SA"/>
+            </w:rPr>
           </w:pPr>
+          <w:r>
+            <w:rPr>
+              <w:rFonts w:eastAsia="" w:cs=""/>
+              <w:kern w:val="0"/>
+              <w:sz w:val="24"/>
+              <w:szCs w:val="24"/>
+              <w:lang w:val="en-US" w:eastAsia="ja-JP" w:bidi="ar-SA"/>
+            </w:rPr>
+            <w:fldChar w:fldCharType="begin"/>
+          </w:r>
+          <w:r>
+            <w:rPr>
+              <w:sz w:val="24"/>
+              <w:kern w:val="0"/>
+              <w:szCs w:val="24"/>
+              <w:rFonts w:eastAsia="" w:cs=""/>
+              <w:lang w:val="en-US" w:eastAsia="ja-JP" w:bidi="ar-SA"/>
+            </w:rPr>
+            <w:instrText xml:space="preserve"> PAGE </w:instrText>
+          </w:r>
+          <w:r>
+            <w:rPr>
+              <w:sz w:val="24"/>
+              <w:kern w:val="0"/>
+              <w:szCs w:val="24"/>
+              <w:rFonts w:eastAsia="" w:cs=""/>
+              <w:lang w:val="en-US" w:eastAsia="ja-JP" w:bidi="ar-SA"/>
+            </w:rPr>
+            <w:fldChar w:fldCharType="separate"/>
+          </w:r>
+          <w:r>
+            <w:rPr>
+              <w:sz w:val="24"/>
+              <w:kern w:val="0"/>
+              <w:szCs w:val="24"/>
+              <w:rFonts w:eastAsia="" w:cs=""/>
+              <w:lang w:val="en-US" w:eastAsia="ja-JP" w:bidi="ar-SA"/>
+            </w:rPr>
+            <w:t>1</w:t>
+          </w:r>
+          <w:r>
+            <w:rPr>
+              <w:sz w:val="24"/>
+              <w:kern w:val="0"/>
+              <w:szCs w:val="24"/>
+              <w:rFonts w:eastAsia="" w:cs=""/>
+              <w:lang w:val="en-US" w:eastAsia="ja-JP" w:bidi="ar-SA"/>
+            </w:rPr>
+            <w:fldChar w:fldCharType="end"/>
+          </w:r>
+        </w:p>
+      </w:tc>
+    </w:tr>
+  </w:tbl>
+  <w:p>
+    <w:pPr>
+      <w:pStyle w:val="Footer"/>
+      <w:bidi w:val="0"/>
+      <w:rPr/>
+    </w:pPr>
+    <w:r>
+      <w:rPr/>
+    </w:r>
+  </w:p>
+</w:ftr>
+</file>
+
+<file path=word/header1.xml><?xml version="1.0" encoding="utf-8"?>
+<w:hdr xmlns:o="urn:schemas-microsoft-com:office:office" xmlns:r="http://schemas.openxmlformats.org/officeDocument/2006/relationships" xmlns:v="urn:schemas-microsoft-com:vml" xmlns:w="http://schemas.openxmlformats.org/wordprocessingml/2006/main" xmlns:w10="urn:schemas-microsoft-com:office:word" xmlns:wp="http://schemas.openxmlformats.org/drawingml/2006/wordprocessingDrawing" xmlns:pic="http://schemas.openxmlformats.org/drawingml/2006/picture" xmlns:wps="http://schemas.microsoft.com/office/word/2010/wordprocessingShape" xmlns:wpg="http://schemas.microsoft.com/office/word/2010/wordprocessingGroup" xmlns:mc="http://schemas.openxmlformats.org/markup-compatibility/2006" xmlns:wp14="http://schemas.microsoft.com/office/word/2010/wordprocessingDrawing" xmlns:w14="http://schemas.microsoft.com/office/word/2010/wordml" xmlns:w15="http://schemas.microsoft.com/office/word/2012/wordml" mc:Ignorable="w14 wp14 w15">
+  <w:p>
+    <w:pPr>
+      <w:pStyle w:val="Header"/>
+      <w:rPr/>
+    </w:pPr>
+    <w:r>
+      <w:rPr/>
+    </w:r>
+  </w:p>
+</w:hdr>
+</file>
+
+<file path=word/header2.xml><?xml version="1.0" encoding="utf-8"?>
+<w:hdr xmlns:o="urn:schemas-microsoft-com:office:office" xmlns:r="http://schemas.openxmlformats.org/officeDocument/2006/relationships" xmlns:v="urn:schemas-microsoft-com:vml" xmlns:w="http://schemas.openxmlformats.org/wordprocessingml/2006/main" xmlns:w10="urn:schemas-microsoft-com:office:word" xmlns:wp="http://schemas.openxmlformats.org/drawingml/2006/wordprocessingDrawing" xmlns:pic="http://schemas.openxmlformats.org/drawingml/2006/picture" xmlns:wps="http://schemas.microsoft.com/office/word/2010/wordprocessingShape" xmlns:wpg="http://schemas.microsoft.com/office/word/2010/wordprocessingGroup" xmlns:mc="http://schemas.openxmlformats.org/markup-compatibility/2006" xmlns:wp14="http://schemas.microsoft.com/office/word/2010/wordprocessingDrawing" xmlns:w14="http://schemas.microsoft.com/office/word/2010/wordml" xmlns:w15="http://schemas.microsoft.com/office/word/2012/wordml" mc:Ignorable="w14 wp14 w15">
+  <w:tbl>
+    <w:tblPr>
+      <w:tblStyle w:val="TableNormal"/>
+      <w:tblW w:w="9360" w:type="dxa"/>
+      <w:jc w:val="start"/>
+      <w:tblInd w:w="0" w:type="dxa"/>
+      <w:tblLayout w:type="fixed"/>
+      <w:tblCellMar>
+        <w:top w:w="0" w:type="dxa"/>
+        <w:start w:w="108" w:type="dxa"/>
+        <w:bottom w:w="0" w:type="dxa"/>
+        <w:end w:w="108" w:type="dxa"/>
+      </w:tblCellMar>
+      <w:tblLook w:val="06a0" w:noHBand="1" w:noVBand="1" w:firstColumn="1" w:lastRow="0" w:lastColumn="0" w:firstRow="1"/>
+    </w:tblPr>
+    <w:tblGrid>
+      <w:gridCol w:w="3120"/>
+      <w:gridCol w:w="3120"/>
+      <w:gridCol w:w="3120"/>
+    </w:tblGrid>
+    <w:tr>
+      <w:trPr>
+        <w:trHeight w:val="300" w:hRule="atLeast"/>
+      </w:trPr>
+      <w:tc>
+        <w:tcPr>
+          <w:tcW w:w="3120" w:type="dxa"/>
+          <w:tcBorders/>
+        </w:tcPr>
+        <w:p>
+          <w:pPr>
+            <w:pStyle w:val="Header"/>
+            <w:widowControl/>
+            <w:bidi w:val="0"/>
+            <w:spacing w:before="0" w:after="0"/>
+            <w:ind w:start="-115"/>
+            <w:jc w:val="start"/>
+            <w:rPr>
+              <w:rFonts w:ascii="Times New Roman" w:hAnsi="Times New Roman" w:eastAsia="" w:cs=""/>
+              <w:kern w:val="0"/>
+              <w:sz w:val="24"/>
+              <w:szCs w:val="24"/>
+              <w:lang w:val="en-US" w:eastAsia="ja-JP" w:bidi="ar-SA"/>
+            </w:rPr>
+          </w:pPr>
+          <w:r>
+            <w:rPr>
+              <w:rFonts w:eastAsia="" w:cs=""/>
+              <w:kern w:val="0"/>
+              <w:sz w:val="24"/>
+              <w:szCs w:val="24"/>
+              <w:lang w:val="en-US" w:eastAsia="ja-JP" w:bidi="ar-SA"/>
+            </w:rPr>
+            <w:t>John Zimmerman</w:t>
+          </w:r>
+        </w:p>
+        <w:p>
+          <w:pPr>
+            <w:pStyle w:val="Header"/>
+            <w:widowControl/>
+            <w:bidi w:val="0"/>
+            <w:spacing w:before="0" w:after="0"/>
+            <w:ind w:start="-115"/>
+            <w:jc w:val="start"/>
+            <w:rPr>
+              <w:rFonts w:ascii="Times New Roman" w:hAnsi="Times New Roman" w:eastAsia="" w:cs=""/>
+              <w:kern w:val="0"/>
+              <w:sz w:val="24"/>
+              <w:szCs w:val="24"/>
+              <w:lang w:val="en-US" w:eastAsia="ja-JP" w:bidi="ar-SA"/>
+            </w:rPr>
+          </w:pPr>
+          <w:r>
+            <w:rPr>
+              <w:rFonts w:eastAsia="" w:cs=""/>
+              <w:kern w:val="0"/>
+              <w:sz w:val="24"/>
+              <w:szCs w:val="24"/>
+              <w:lang w:val="en-US" w:eastAsia="ja-JP" w:bidi="ar-SA"/>
+            </w:rPr>
+            <w:t>IT Security Awareness</w:t>
+          </w:r>
+        </w:p>
+      </w:tc>
+      <w:tc>
+        <w:tcPr>
+          <w:tcW w:w="3120" w:type="dxa"/>
+          <w:tcBorders/>
+        </w:tcPr>
+        <w:p>
+          <w:pPr>
+            <w:pStyle w:val="Header"/>
+            <w:widowControl/>
+            <w:bidi w:val="0"/>
+            <w:spacing w:before="0" w:after="0"/>
+            <w:jc w:val="center"/>
+            <w:rPr>
+              <w:rFonts w:ascii="Times New Roman" w:hAnsi="Times New Roman" w:eastAsia="" w:cs=""/>
+              <w:kern w:val="0"/>
+              <w:sz w:val="24"/>
+              <w:szCs w:val="24"/>
+              <w:lang w:val="en-US" w:eastAsia="ja-JP" w:bidi="ar-SA"/>
+            </w:rPr>
+          </w:pPr>
+          <w:r>
+            <w:rPr>
+              <w:rFonts w:eastAsia="" w:cs=""/>
+              <w:kern w:val="0"/>
+              <w:sz w:val="24"/>
+              <w:szCs w:val="24"/>
+              <w:lang w:val="en-US" w:eastAsia="ja-JP" w:bidi="ar-SA"/>
+            </w:rPr>
+          </w:r>
+        </w:p>
+      </w:tc>
+      <w:tc>
+        <w:tcPr>
+          <w:tcW w:w="3120" w:type="dxa"/>
+          <w:tcBorders/>
+        </w:tcPr>
+        <w:p>
+          <w:pPr>
+            <w:pStyle w:val="Header"/>
+            <w:widowControl/>
+            <w:bidi w:val="0"/>
+            <w:spacing w:before="0" w:after="0"/>
+            <w:ind w:end="-115"/>
+            <w:jc w:val="end"/>
+            <w:rPr>
+              <w:rFonts w:ascii="Times New Roman" w:hAnsi="Times New Roman" w:eastAsia="" w:cs=""/>
+              <w:kern w:val="0"/>
+              <w:sz w:val="24"/>
+              <w:szCs w:val="24"/>
+              <w:lang w:val="en-US" w:eastAsia="ja-JP" w:bidi="ar-SA"/>
+            </w:rPr>
+          </w:pPr>
+          <w:r>
+            <w:rPr>
+              <w:rFonts w:eastAsia="" w:cs=""/>
+              <w:kern w:val="0"/>
+              <w:sz w:val="24"/>
+              <w:szCs w:val="24"/>
+              <w:lang w:val="en-US" w:eastAsia="ja-JP" w:bidi="ar-SA"/>
+            </w:rPr>
+          </w:r>
         </w:p>
       </w:tc>
     </w:tr>
@@ -286,137 +776,185 @@
     <w:pPr>
       <w:pStyle w:val="Header"/>
       <w:bidi w:val="0"/>
+      <w:rPr/>
     </w:pPr>
+    <w:r>
+      <w:rPr/>
+    </w:r>
   </w:p>
 </w:hdr>
 </file>
 
-<file path=word/numbering.xml><?xml version="1.0" encoding="utf-8"?>
-<w:numbering xmlns:w="http://schemas.openxmlformats.org/wordprocessingml/2006/main">
-  <w:abstractNum xmlns:w="http://schemas.openxmlformats.org/wordprocessingml/2006/main" w:abstractNumId="1">
-    <w:nsid w:val="1148b586"/>
-    <w:multiLevelType xmlns:w="http://schemas.openxmlformats.org/wordprocessingml/2006/main" w:val="hybridMultilevel"/>
-    <w:lvl xmlns:w="http://schemas.openxmlformats.org/wordprocessingml/2006/main" w:ilvl="0">
-      <w:start w:val="1"/>
-      <w:numFmt w:val="bullet"/>
-      <w:lvlText w:val=""/>
-      <w:lvlJc w:val="left"/>
-      <w:pPr>
-        <w:ind w:left="720" w:hanging="360"/>
-      </w:pPr>
-      <w:rPr>
-        <w:rFonts w:hint="default" w:ascii="Symbol" w:hAnsi="Symbol"/>
-      </w:rPr>
-    </w:lvl>
-    <w:lvl xmlns:w="http://schemas.openxmlformats.org/wordprocessingml/2006/main" w:ilvl="1">
-      <w:start w:val="1"/>
-      <w:numFmt w:val="bullet"/>
-      <w:lvlText w:val="o"/>
-      <w:lvlJc w:val="left"/>
-      <w:pPr>
-        <w:ind w:left="1440" w:hanging="360"/>
-      </w:pPr>
-      <w:rPr>
-        <w:rFonts w:hint="default" w:ascii="Courier New" w:hAnsi="Courier New"/>
-      </w:rPr>
-    </w:lvl>
-    <w:lvl xmlns:w="http://schemas.openxmlformats.org/wordprocessingml/2006/main" w:ilvl="2">
-      <w:start w:val="1"/>
-      <w:numFmt w:val="bullet"/>
-      <w:lvlText w:val=""/>
-      <w:lvlJc w:val="left"/>
-      <w:pPr>
-        <w:ind w:left="2160" w:hanging="360"/>
-      </w:pPr>
-      <w:rPr>
-        <w:rFonts w:hint="default" w:ascii="Wingdings" w:hAnsi="Wingdings"/>
-      </w:rPr>
-    </w:lvl>
-    <w:lvl xmlns:w="http://schemas.openxmlformats.org/wordprocessingml/2006/main" w:ilvl="3">
-      <w:start w:val="1"/>
-      <w:numFmt w:val="bullet"/>
-      <w:lvlText w:val=""/>
-      <w:lvlJc w:val="left"/>
-      <w:pPr>
-        <w:ind w:left="2880" w:hanging="360"/>
-      </w:pPr>
-      <w:rPr>
-        <w:rFonts w:hint="default" w:ascii="Symbol" w:hAnsi="Symbol"/>
-      </w:rPr>
-    </w:lvl>
-    <w:lvl xmlns:w="http://schemas.openxmlformats.org/wordprocessingml/2006/main" w:ilvl="4">
-      <w:start w:val="1"/>
-      <w:numFmt w:val="bullet"/>
-      <w:lvlText w:val="o"/>
-      <w:lvlJc w:val="left"/>
-      <w:pPr>
-        <w:ind w:left="3600" w:hanging="360"/>
-      </w:pPr>
-      <w:rPr>
-        <w:rFonts w:hint="default" w:ascii="Courier New" w:hAnsi="Courier New"/>
-      </w:rPr>
-    </w:lvl>
-    <w:lvl xmlns:w="http://schemas.openxmlformats.org/wordprocessingml/2006/main" w:ilvl="5">
-      <w:start w:val="1"/>
-      <w:numFmt w:val="bullet"/>
-      <w:lvlText w:val=""/>
-      <w:lvlJc w:val="left"/>
-      <w:pPr>
-        <w:ind w:left="4320" w:hanging="360"/>
-      </w:pPr>
-      <w:rPr>
-        <w:rFonts w:hint="default" w:ascii="Wingdings" w:hAnsi="Wingdings"/>
-      </w:rPr>
-    </w:lvl>
-    <w:lvl xmlns:w="http://schemas.openxmlformats.org/wordprocessingml/2006/main" w:ilvl="6">
-      <w:start w:val="1"/>
-      <w:numFmt w:val="bullet"/>
-      <w:lvlText w:val=""/>
-      <w:lvlJc w:val="left"/>
-      <w:pPr>
-        <w:ind w:left="5040" w:hanging="360"/>
-      </w:pPr>
-      <w:rPr>
-        <w:rFonts w:hint="default" w:ascii="Symbol" w:hAnsi="Symbol"/>
-      </w:rPr>
-    </w:lvl>
-    <w:lvl xmlns:w="http://schemas.openxmlformats.org/wordprocessingml/2006/main" w:ilvl="7">
-      <w:start w:val="1"/>
-      <w:numFmt w:val="bullet"/>
-      <w:lvlText w:val="o"/>
-      <w:lvlJc w:val="left"/>
-      <w:pPr>
-        <w:ind w:left="5760" w:hanging="360"/>
-      </w:pPr>
-      <w:rPr>
-        <w:rFonts w:hint="default" w:ascii="Courier New" w:hAnsi="Courier New"/>
-      </w:rPr>
-    </w:lvl>
-    <w:lvl xmlns:w="http://schemas.openxmlformats.org/wordprocessingml/2006/main" w:ilvl="8">
-      <w:start w:val="1"/>
-      <w:numFmt w:val="bullet"/>
-      <w:lvlText w:val=""/>
-      <w:lvlJc w:val="left"/>
-      <w:pPr>
-        <w:ind w:left="6480" w:hanging="360"/>
-      </w:pPr>
-      <w:rPr>
-        <w:rFonts w:hint="default" w:ascii="Wingdings" w:hAnsi="Wingdings"/>
-      </w:rPr>
-    </w:lvl>
-  </w:abstractNum>
-  <w:num w:numId="1">
-    <w:abstractNumId w:val="1"/>
-  </w:num>
-</w:numbering>
+<file path=word/header3.xml><?xml version="1.0" encoding="utf-8"?>
+<w:hdr xmlns:o="urn:schemas-microsoft-com:office:office" xmlns:r="http://schemas.openxmlformats.org/officeDocument/2006/relationships" xmlns:v="urn:schemas-microsoft-com:vml" xmlns:w="http://schemas.openxmlformats.org/wordprocessingml/2006/main" xmlns:w10="urn:schemas-microsoft-com:office:word" xmlns:wp="http://schemas.openxmlformats.org/drawingml/2006/wordprocessingDrawing" xmlns:pic="http://schemas.openxmlformats.org/drawingml/2006/picture" xmlns:wps="http://schemas.microsoft.com/office/word/2010/wordprocessingShape" xmlns:wpg="http://schemas.microsoft.com/office/word/2010/wordprocessingGroup" xmlns:mc="http://schemas.openxmlformats.org/markup-compatibility/2006" xmlns:wp14="http://schemas.microsoft.com/office/word/2010/wordprocessingDrawing" xmlns:w14="http://schemas.microsoft.com/office/word/2010/wordml" xmlns:w15="http://schemas.microsoft.com/office/word/2012/wordml" mc:Ignorable="w14 wp14 w15">
+  <w:tbl>
+    <w:tblPr>
+      <w:tblStyle w:val="TableNormal"/>
+      <w:tblW w:w="9360" w:type="dxa"/>
+      <w:jc w:val="start"/>
+      <w:tblInd w:w="0" w:type="dxa"/>
+      <w:tblLayout w:type="fixed"/>
+      <w:tblCellMar>
+        <w:top w:w="0" w:type="dxa"/>
+        <w:start w:w="108" w:type="dxa"/>
+        <w:bottom w:w="0" w:type="dxa"/>
+        <w:end w:w="108" w:type="dxa"/>
+      </w:tblCellMar>
+      <w:tblLook w:val="06a0" w:noHBand="1" w:noVBand="1" w:firstColumn="1" w:lastRow="0" w:lastColumn="0" w:firstRow="1"/>
+    </w:tblPr>
+    <w:tblGrid>
+      <w:gridCol w:w="3120"/>
+      <w:gridCol w:w="3120"/>
+      <w:gridCol w:w="3120"/>
+    </w:tblGrid>
+    <w:tr>
+      <w:trPr>
+        <w:trHeight w:val="300" w:hRule="atLeast"/>
+      </w:trPr>
+      <w:tc>
+        <w:tcPr>
+          <w:tcW w:w="3120" w:type="dxa"/>
+          <w:tcBorders/>
+        </w:tcPr>
+        <w:p>
+          <w:pPr>
+            <w:pStyle w:val="Header"/>
+            <w:widowControl/>
+            <w:bidi w:val="0"/>
+            <w:spacing w:before="0" w:after="0"/>
+            <w:ind w:start="-115"/>
+            <w:jc w:val="start"/>
+            <w:rPr>
+              <w:rFonts w:ascii="Times New Roman" w:hAnsi="Times New Roman" w:eastAsia="" w:cs=""/>
+              <w:kern w:val="0"/>
+              <w:sz w:val="24"/>
+              <w:szCs w:val="24"/>
+              <w:lang w:val="en-US" w:eastAsia="ja-JP" w:bidi="ar-SA"/>
+            </w:rPr>
+          </w:pPr>
+          <w:r>
+            <w:rPr>
+              <w:rFonts w:eastAsia="" w:cs=""/>
+              <w:kern w:val="0"/>
+              <w:sz w:val="24"/>
+              <w:szCs w:val="24"/>
+              <w:lang w:val="en-US" w:eastAsia="ja-JP" w:bidi="ar-SA"/>
+            </w:rPr>
+            <w:t>John Zimmerman</w:t>
+          </w:r>
+        </w:p>
+        <w:p>
+          <w:pPr>
+            <w:pStyle w:val="Header"/>
+            <w:widowControl/>
+            <w:bidi w:val="0"/>
+            <w:spacing w:before="0" w:after="0"/>
+            <w:ind w:start="-115"/>
+            <w:jc w:val="start"/>
+            <w:rPr>
+              <w:rFonts w:ascii="Times New Roman" w:hAnsi="Times New Roman" w:eastAsia="" w:cs=""/>
+              <w:kern w:val="0"/>
+              <w:sz w:val="24"/>
+              <w:szCs w:val="24"/>
+              <w:lang w:val="en-US" w:eastAsia="ja-JP" w:bidi="ar-SA"/>
+            </w:rPr>
+          </w:pPr>
+          <w:r>
+            <w:rPr>
+              <w:rFonts w:eastAsia="" w:cs=""/>
+              <w:kern w:val="0"/>
+              <w:sz w:val="24"/>
+              <w:szCs w:val="24"/>
+              <w:lang w:val="en-US" w:eastAsia="ja-JP" w:bidi="ar-SA"/>
+            </w:rPr>
+            <w:t>IT Security Awareness</w:t>
+          </w:r>
+        </w:p>
+      </w:tc>
+      <w:tc>
+        <w:tcPr>
+          <w:tcW w:w="3120" w:type="dxa"/>
+          <w:tcBorders/>
+        </w:tcPr>
+        <w:p>
+          <w:pPr>
+            <w:pStyle w:val="Header"/>
+            <w:widowControl/>
+            <w:bidi w:val="0"/>
+            <w:spacing w:before="0" w:after="0"/>
+            <w:jc w:val="center"/>
+            <w:rPr>
+              <w:rFonts w:ascii="Times New Roman" w:hAnsi="Times New Roman" w:eastAsia="" w:cs=""/>
+              <w:kern w:val="0"/>
+              <w:sz w:val="24"/>
+              <w:szCs w:val="24"/>
+              <w:lang w:val="en-US" w:eastAsia="ja-JP" w:bidi="ar-SA"/>
+            </w:rPr>
+          </w:pPr>
+          <w:r>
+            <w:rPr>
+              <w:rFonts w:eastAsia="" w:cs=""/>
+              <w:kern w:val="0"/>
+              <w:sz w:val="24"/>
+              <w:szCs w:val="24"/>
+              <w:lang w:val="en-US" w:eastAsia="ja-JP" w:bidi="ar-SA"/>
+            </w:rPr>
+          </w:r>
+        </w:p>
+      </w:tc>
+      <w:tc>
+        <w:tcPr>
+          <w:tcW w:w="3120" w:type="dxa"/>
+          <w:tcBorders/>
+        </w:tcPr>
+        <w:p>
+          <w:pPr>
+            <w:pStyle w:val="Header"/>
+            <w:widowControl/>
+            <w:bidi w:val="0"/>
+            <w:spacing w:before="0" w:after="0"/>
+            <w:ind w:end="-115"/>
+            <w:jc w:val="end"/>
+            <w:rPr>
+              <w:rFonts w:ascii="Times New Roman" w:hAnsi="Times New Roman" w:eastAsia="" w:cs=""/>
+              <w:kern w:val="0"/>
+              <w:sz w:val="24"/>
+              <w:szCs w:val="24"/>
+              <w:lang w:val="en-US" w:eastAsia="ja-JP" w:bidi="ar-SA"/>
+            </w:rPr>
+          </w:pPr>
+          <w:r>
+            <w:rPr>
+              <w:rFonts w:eastAsia="" w:cs=""/>
+              <w:kern w:val="0"/>
+              <w:sz w:val="24"/>
+              <w:szCs w:val="24"/>
+              <w:lang w:val="en-US" w:eastAsia="ja-JP" w:bidi="ar-SA"/>
+            </w:rPr>
+          </w:r>
+        </w:p>
+      </w:tc>
+    </w:tr>
+  </w:tbl>
+  <w:p>
+    <w:pPr>
+      <w:pStyle w:val="Header"/>
+      <w:bidi w:val="0"/>
+      <w:rPr/>
+    </w:pPr>
+    <w:r>
+      <w:rPr/>
+    </w:r>
+  </w:p>
+</w:hdr>
 </file>
 
 <file path=word/styles.xml><?xml version="1.0" encoding="utf-8"?>
-<w:styles xmlns:wp14="http://schemas.microsoft.com/office/word/2010/wordprocessingDrawing" xmlns:mc="http://schemas.openxmlformats.org/markup-compatibility/2006" xmlns:r="http://schemas.openxmlformats.org/officeDocument/2006/relationships" xmlns:w="http://schemas.openxmlformats.org/wordprocessingml/2006/main" xmlns:w14="http://schemas.microsoft.com/office/word/2010/wordml" xmlns:w15="http://schemas.microsoft.com/office/word/2012/wordml" xmlns:w16se="http://schemas.microsoft.com/office/word/2015/wordml/symex" xmlns:w16cid="http://schemas.microsoft.com/office/word/2016/wordml/cid" xmlns:w16="http://schemas.microsoft.com/office/word/2018/wordml" xmlns:w16cex="http://schemas.microsoft.com/office/word/2018/wordml/cex" xmlns:w16sdtdh="http://schemas.microsoft.com/office/word/2020/wordml/sdtdatahash" xmlns:w16sdtfl="http://schemas.microsoft.com/office/word/2024/wordml/sdtformatlock" mc:Ignorable="w14 w15 wp14 w16se w16cid w16 w16cex w16sdtdh w16sdtfl">
+<w:styles xmlns:w="http://schemas.openxmlformats.org/wordprocessingml/2006/main" xmlns:w14="http://schemas.microsoft.com/office/word/2010/wordml" xmlns:mc="http://schemas.openxmlformats.org/markup-compatibility/2006" mc:Ignorable="w14">
   <w:docDefaults>
     <w:rPrDefault>
       <w:rPr>
-        <w:rFonts w:asciiTheme="minorHAnsi" w:hAnsiTheme="minorHAnsi" w:eastAsiaTheme="minorEastAsia" w:cstheme="minorBidi"/>
+        <w:rFonts w:ascii="Times New Roman" w:hAnsi="Times New Roman" w:eastAsia="" w:cs="" w:asciiTheme="minorHAnsi" w:cstheme="minorBidi" w:eastAsiaTheme="minorEastAsia" w:hAnsiTheme="minorHAnsi"/>
         <w:sz w:val="24"/>
         <w:szCs w:val="24"/>
         <w:lang w:val="en-US" w:eastAsia="ja-JP" w:bidi="ar-SA"/>
@@ -424,7 +962,7 @@
     </w:rPrDefault>
     <w:pPrDefault>
       <w:pPr>
-        <w:spacing w:after="160" w:line="279" w:lineRule="auto"/>
+        <w:suppressAutoHyphens w:val="true"/>
       </w:pPr>
     </w:pPrDefault>
   </w:docDefaults>
@@ -804,20 +1342,173 @@
   <w:style w:type="paragraph" w:styleId="Normal" w:default="1">
     <w:name w:val="Normal"/>
     <w:qFormat/>
+    <w:pPr>
+      <w:widowControl/>
+      <w:bidi w:val="0"/>
+      <w:spacing w:lineRule="auto" w:line="278" w:before="0" w:after="160"/>
+      <w:jc w:val="start"/>
+    </w:pPr>
+    <w:rPr>
+      <w:rFonts w:ascii="Times New Roman" w:hAnsi="Times New Roman" w:eastAsia="" w:cs="" w:asciiTheme="minorHAnsi" w:cstheme="minorBidi" w:eastAsiaTheme="minorEastAsia" w:hAnsiTheme="minorHAnsi"/>
+      <w:color w:val="auto"/>
+      <w:kern w:val="0"/>
+      <w:sz w:val="24"/>
+      <w:szCs w:val="24"/>
+      <w:lang w:val="en-US" w:eastAsia="ja-JP" w:bidi="ar-SA"/>
+    </w:rPr>
+  </w:style>
+  <w:style w:type="paragraph" w:styleId="Heading3">
+    <w:name w:val="heading 3"/>
+    <w:basedOn w:val="Normal"/>
+    <w:next w:val="Normal"/>
+    <w:uiPriority w:val="9"/>
+    <w:unhideWhenUsed/>
+    <w:qFormat/>
+    <w:rsid w:val="2311c13a"/>
+    <w:pPr>
+      <w:keepNext w:val="true"/>
+      <w:keepLines/>
+      <w:spacing w:before="160" w:after="80"/>
+      <w:outlineLvl w:val="2"/>
+    </w:pPr>
+    <w:rPr>
+      <w:rFonts w:eastAsia="" w:cs="" w:cstheme="majorBidi" w:eastAsiaTheme="majorEastAsia"/>
+      <w:color w:themeColor="accent1" w:themeShade="bf" w:val="0F4761"/>
+      <w:sz w:val="28"/>
+      <w:szCs w:val="28"/>
+    </w:rPr>
   </w:style>
   <w:style w:type="character" w:styleId="DefaultParagraphFont" w:default="1">
     <w:name w:val="Default Paragraph Font"/>
     <w:uiPriority w:val="1"/>
     <w:semiHidden/>
     <w:unhideWhenUsed/>
+    <w:qFormat/>
+    <w:rPr/>
   </w:style>
-  <w:style w:type="table" w:styleId="TableNormal" w:default="1">
+  <w:style w:type="paragraph" w:styleId="Heading">
+    <w:name w:val="Heading"/>
+    <w:basedOn w:val="Normal"/>
+    <w:next w:val="BodyText"/>
+    <w:qFormat/>
+    <w:pPr>
+      <w:keepNext w:val="true"/>
+      <w:spacing w:before="240" w:after="120"/>
+    </w:pPr>
+    <w:rPr>
+      <w:rFonts w:ascii="Liberation Sans" w:hAnsi="Liberation Sans" w:eastAsia="Noto Sans CJK SC" w:cs="Noto Sans Devanagari"/>
+      <w:sz w:val="28"/>
+      <w:szCs w:val="28"/>
+    </w:rPr>
+  </w:style>
+  <w:style w:type="paragraph" w:styleId="BodyText">
+    <w:name w:val="Body Text"/>
+    <w:basedOn w:val="Normal"/>
+    <w:pPr>
+      <w:spacing w:lineRule="auto" w:line="276" w:before="0" w:after="140"/>
+    </w:pPr>
+    <w:rPr/>
+  </w:style>
+  <w:style w:type="paragraph" w:styleId="List">
+    <w:name w:val="List"/>
+    <w:basedOn w:val="BodyText"/>
+    <w:pPr/>
+    <w:rPr>
+      <w:rFonts w:cs="Noto Sans Devanagari"/>
+    </w:rPr>
+  </w:style>
+  <w:style w:type="paragraph" w:styleId="Caption">
+    <w:name w:val="caption"/>
+    <w:basedOn w:val="Normal"/>
+    <w:qFormat/>
+    <w:pPr>
+      <w:suppressLineNumbers/>
+      <w:spacing w:before="120" w:after="120"/>
+    </w:pPr>
+    <w:rPr>
+      <w:rFonts w:cs="Noto Sans Devanagari"/>
+      <w:i/>
+      <w:iCs/>
+      <w:sz w:val="24"/>
+      <w:szCs w:val="24"/>
+    </w:rPr>
+  </w:style>
+  <w:style w:type="paragraph" w:styleId="Index">
+    <w:name w:val="Index"/>
+    <w:basedOn w:val="Normal"/>
+    <w:qFormat/>
+    <w:pPr>
+      <w:suppressLineNumbers/>
+    </w:pPr>
+    <w:rPr>
+      <w:rFonts w:cs="Noto Sans Devanagari"/>
+    </w:rPr>
+  </w:style>
+  <w:style w:type="paragraph" w:styleId="HeaderandFooter">
+    <w:name w:val="Header and Footer"/>
+    <w:basedOn w:val="Normal"/>
+    <w:qFormat/>
+    <w:pPr/>
+    <w:rPr/>
+  </w:style>
+  <w:style w:type="paragraph" w:styleId="Header">
+    <w:name w:val="header"/>
+    <w:basedOn w:val="Normal"/>
+    <w:uiPriority w:val="99"/>
+    <w:unhideWhenUsed/>
+    <w:rsid w:val="2311c13a"/>
+    <w:pPr>
+      <w:tabs>
+        <w:tab w:val="clear" w:pos="720"/>
+        <w:tab w:val="center" w:pos="4680" w:leader="none"/>
+        <w:tab w:val="right" w:pos="9360" w:leader="none"/>
+      </w:tabs>
+      <w:spacing w:lineRule="auto" w:line="240" w:before="0" w:after="0"/>
+    </w:pPr>
+    <w:rPr/>
+  </w:style>
+  <w:style w:type="paragraph" w:styleId="Footer">
+    <w:name w:val="footer"/>
+    <w:basedOn w:val="Normal"/>
+    <w:uiPriority w:val="99"/>
+    <w:unhideWhenUsed/>
+    <w:rsid w:val="2311c13a"/>
+    <w:pPr>
+      <w:tabs>
+        <w:tab w:val="clear" w:pos="720"/>
+        <w:tab w:val="center" w:pos="4680" w:leader="none"/>
+        <w:tab w:val="right" w:pos="9360" w:leader="none"/>
+      </w:tabs>
+      <w:spacing w:lineRule="auto" w:line="240" w:before="0" w:after="0"/>
+    </w:pPr>
+    <w:rPr/>
+  </w:style>
+  <w:style w:type="paragraph" w:styleId="ListParagraph">
+    <w:name w:val="List Paragraph"/>
+    <w:basedOn w:val="Normal"/>
+    <w:uiPriority w:val="34"/>
+    <w:qFormat/>
+    <w:rsid w:val="2311c13a"/>
+    <w:pPr>
+      <w:spacing w:before="0" w:after="160"/>
+      <w:ind w:start="720"/>
+      <w:contextualSpacing/>
+    </w:pPr>
+    <w:rPr/>
+  </w:style>
+  <w:style w:type="numbering" w:styleId="NoList" w:default="1">
+    <w:name w:val="No List"/>
+    <w:uiPriority w:val="99"/>
+    <w:semiHidden/>
+    <w:unhideWhenUsed/>
+    <w:qFormat/>
+  </w:style>
+  <w:style w:type="table" w:default="1" w:styleId="TableNormal">
     <w:name w:val="Normal Table"/>
     <w:uiPriority w:val="99"/>
     <w:semiHidden/>
     <w:unhideWhenUsed/>
     <w:tblPr>
-      <w:tblInd w:w="0" w:type="dxa"/>
       <w:tblCellMar>
         <w:top w:w="0" w:type="dxa"/>
         <w:left w:w="108" w:type="dxa"/>
@@ -826,83 +1517,15 @@
       </w:tblCellMar>
     </w:tblPr>
   </w:style>
-  <w:style w:type="numbering" w:styleId="NoList" w:default="1">
-    <w:name w:val="No List"/>
-    <w:uiPriority w:val="99"/>
-    <w:semiHidden/>
-    <w:unhideWhenUsed/>
-  </w:style>
-  <w:style w:type="paragraph" w:styleId="Header">
-    <w:uiPriority w:val="99"/>
-    <w:name w:val="header"/>
-    <w:basedOn w:val="Normal"/>
-    <w:unhideWhenUsed/>
-    <w:rsid w:val="2311C13A"/>
+  <w:style w:type="table" w:styleId="TableGrid">
+    <w:name w:val="Table Grid"/>
+    <w:basedOn w:val="TableNormal"/>
+    <w:uiPriority w:val="59"/>
+    <w:rsid w:val="00fb4123"/>
     <w:pPr>
-      <w:tabs>
-        <w:tab w:val="center" w:leader="none" w:pos="4680"/>
-        <w:tab w:val="right" w:leader="none" w:pos="9360"/>
-      </w:tabs>
       <w:spacing w:after="0" w:line="240" w:lineRule="auto"/>
     </w:pPr>
-  </w:style>
-  <w:style w:type="paragraph" w:styleId="Footer">
-    <w:uiPriority w:val="99"/>
-    <w:name w:val="footer"/>
-    <w:basedOn w:val="Normal"/>
-    <w:unhideWhenUsed/>
-    <w:rsid w:val="2311C13A"/>
-    <w:pPr>
-      <w:tabs>
-        <w:tab w:val="center" w:leader="none" w:pos="4680"/>
-        <w:tab w:val="right" w:leader="none" w:pos="9360"/>
-      </w:tabs>
-      <w:spacing w:after="0" w:line="240" w:lineRule="auto"/>
-    </w:pPr>
-  </w:style>
-  <w:style w:type="paragraph" w:styleId="Heading3">
-    <w:uiPriority w:val="9"/>
-    <w:name w:val="heading 3"/>
-    <w:basedOn w:val="Normal"/>
-    <w:next w:val="Normal"/>
-    <w:unhideWhenUsed/>
-    <w:qFormat/>
-    <w:rsid w:val="2311C13A"/>
-    <w:rPr>
-      <w:rFonts w:eastAsia="" w:cs="" w:eastAsiaTheme="majorEastAsia" w:cstheme="majorBidi"/>
-      <w:color w:val="0F4761" w:themeColor="accent1" w:themeTint="FF" w:themeShade="BF"/>
-      <w:sz w:val="28"/>
-      <w:szCs w:val="28"/>
-    </w:rPr>
-    <w:pPr>
-      <w:keepNext w:val="1"/>
-      <w:keepLines w:val="1"/>
-      <w:spacing w:before="160" w:after="80"/>
-      <w:outlineLvl w:val="2"/>
-    </w:pPr>
-  </w:style>
-  <w:style w:type="paragraph" w:styleId="ListParagraph">
-    <w:uiPriority w:val="34"/>
-    <w:name w:val="List Paragraph"/>
-    <w:basedOn w:val="Normal"/>
-    <w:qFormat/>
-    <w:rsid w:val="2311C13A"/>
-    <w:pPr>
-      <w:spacing/>
-      <w:ind w:left="720"/>
-      <w:contextualSpacing/>
-    </w:pPr>
-  </w:style>
-  <w:style xmlns:w="http://schemas.openxmlformats.org/wordprocessingml/2006/main" w:type="table" w:styleId="TableGrid">
-    <w:name xmlns:w="http://schemas.openxmlformats.org/wordprocessingml/2006/main" w:val="Table Grid"/>
-    <w:basedOn xmlns:w="http://schemas.openxmlformats.org/wordprocessingml/2006/main" w:val="TableNormal"/>
-    <w:uiPriority xmlns:w="http://schemas.openxmlformats.org/wordprocessingml/2006/main" w:val="59"/>
-    <w:rsid xmlns:w="http://schemas.openxmlformats.org/wordprocessingml/2006/main" w:val="00FB4123"/>
-    <w:pPr xmlns:w="http://schemas.openxmlformats.org/wordprocessingml/2006/main">
-      <w:spacing w:after="0" w:line="240" w:lineRule="auto"/>
-    </w:pPr>
-    <w:tblPr xmlns:w="http://schemas.openxmlformats.org/wordprocessingml/2006/main">
-      <w:tblInd w:w="0" w:type="dxa"/>
+    <w:tblPr>
       <w:tblBorders>
         <w:top w:val="single" w:color="000000" w:themeColor="text1" w:sz="4" w:space="0"/>
         <w:left w:val="single" w:color="000000" w:themeColor="text1" w:sz="4" w:space="0"/>
@@ -923,161 +1546,97 @@
 </file>
 
 <file path=word/theme/theme1.xml><?xml version="1.0" encoding="utf-8"?>
-<a:theme xmlns:thm15="http://schemas.microsoft.com/office/thememl/2012/main" xmlns:a="http://schemas.openxmlformats.org/drawingml/2006/main" name="Office Theme">
+<a:theme xmlns:a="http://schemas.openxmlformats.org/drawingml/2006/main" xmlns:r="http://schemas.openxmlformats.org/officeDocument/2006/relationships" name="Office Theme">
   <a:themeElements>
     <a:clrScheme name="Office">
       <a:dk1>
-        <a:sysClr val="windowText" lastClr="000000"/>
+        <a:srgbClr val="000000"/>
       </a:dk1>
       <a:lt1>
-        <a:sysClr val="window" lastClr="FFFFFF"/>
+        <a:srgbClr val="ffffff"/>
       </a:lt1>
       <a:dk2>
-        <a:srgbClr val="0E2841"/>
+        <a:srgbClr val="0e2841"/>
       </a:dk2>
       <a:lt2>
-        <a:srgbClr val="E8E8E8"/>
+        <a:srgbClr val="e8e8e8"/>
       </a:lt2>
       <a:accent1>
         <a:srgbClr val="156082"/>
       </a:accent1>
       <a:accent2>
-        <a:srgbClr val="E97132"/>
+        <a:srgbClr val="e97132"/>
       </a:accent2>
       <a:accent3>
-        <a:srgbClr val="196B24"/>
+        <a:srgbClr val="196b24"/>
       </a:accent3>
       <a:accent4>
-        <a:srgbClr val="0F9ED5"/>
+        <a:srgbClr val="0f9ed5"/>
       </a:accent4>
       <a:accent5>
-        <a:srgbClr val="A02B93"/>
+        <a:srgbClr val="a02b93"/>
       </a:accent5>
       <a:accent6>
-        <a:srgbClr val="4EA72E"/>
+        <a:srgbClr val="4ea72e"/>
       </a:accent6>
       <a:hlink>
         <a:srgbClr val="467886"/>
       </a:hlink>
       <a:folHlink>
-        <a:srgbClr val="96607D"/>
+        <a:srgbClr val="96607d"/>
       </a:folHlink>
     </a:clrScheme>
     <a:fontScheme name="Office">
       <a:majorFont>
-        <a:latin typeface="Aptos Display"/>
+        <a:latin typeface="Aptos Display" pitchFamily="0" charset="1"/>
         <a:ea typeface=""/>
         <a:cs typeface=""/>
-        <a:font script="Jpan" typeface="ＭＳ ゴシック"/>
-        <a:font script="Hang" typeface="맑은 고딕"/>
-        <a:font script="Hans" typeface="宋体"/>
-        <a:font script="Hant" typeface="新細明體"/>
-        <a:font script="Arab" typeface="Times New Roman"/>
-        <a:font script="Hebr" typeface="Times New Roman"/>
-        <a:font script="Thai" typeface="Angsana New"/>
-        <a:font script="Ethi" typeface="Nyala"/>
-        <a:font script="Beng" typeface="Vrinda"/>
-        <a:font script="Gujr" typeface="Shruti"/>
-        <a:font script="Khmr" typeface="MoolBoran"/>
-        <a:font script="Knda" typeface="Tunga"/>
-        <a:font script="Guru" typeface="Raavi"/>
-        <a:font script="Cans" typeface="Euphemia"/>
-        <a:font script="Cher" typeface="Plantagenet Cherokee"/>
-        <a:font script="Yiii" typeface="Microsoft Yi Baiti"/>
-        <a:font script="Tibt" typeface="Microsoft Himalaya"/>
-        <a:font script="Thaa" typeface="MV Boli"/>
-        <a:font script="Deva" typeface="Mangal"/>
-        <a:font script="Telu" typeface="Gautami"/>
-        <a:font script="Taml" typeface="Latha"/>
-        <a:font script="Syrc" typeface="Estrangelo Edessa"/>
-        <a:font script="Orya" typeface="Kalinga"/>
-        <a:font script="Mlym" typeface="Kartika"/>
-        <a:font script="Laoo" typeface="DokChampa"/>
-        <a:font script="Sinh" typeface="Iskoola Pota"/>
-        <a:font script="Mong" typeface="Mongolian Baiti"/>
-        <a:font script="Viet" typeface="Times New Roman"/>
-        <a:font script="Uigh" typeface="Microsoft Uighur"/>
-        <a:font script="Geor" typeface="Sylfaen"/>
       </a:majorFont>
       <a:minorFont>
-        <a:latin typeface="Times New Roman"/>
+        <a:latin typeface="Times New Roman" pitchFamily="0" charset="1"/>
         <a:ea typeface=""/>
         <a:cs typeface=""/>
-        <a:font script="Jpan" typeface="ＭＳ 明朝"/>
-        <a:font script="Hang" typeface="맑은 고딕"/>
-        <a:font script="Hans" typeface="宋体"/>
-        <a:font script="Hant" typeface="新細明體"/>
-        <a:font script="Arab" typeface="Arial"/>
-        <a:font script="Hebr" typeface="Arial"/>
-        <a:font script="Thai" typeface="Cordia New"/>
-        <a:font script="Ethi" typeface="Nyala"/>
-        <a:font script="Beng" typeface="Vrinda"/>
-        <a:font script="Gujr" typeface="Shruti"/>
-        <a:font script="Khmr" typeface="DaunPenh"/>
-        <a:font script="Knda" typeface="Tunga"/>
-        <a:font script="Guru" typeface="Raavi"/>
-        <a:font script="Cans" typeface="Euphemia"/>
-        <a:font script="Cher" typeface="Plantagenet Cherokee"/>
-        <a:font script="Yiii" typeface="Microsoft Yi Baiti"/>
-        <a:font script="Tibt" typeface="Microsoft Himalaya"/>
-        <a:font script="Thaa" typeface="MV Boli"/>
-        <a:font script="Deva" typeface="Mangal"/>
-        <a:font script="Telu" typeface="Gautami"/>
-        <a:font script="Taml" typeface="Latha"/>
-        <a:font script="Syrc" typeface="Estrangelo Edessa"/>
-        <a:font script="Orya" typeface="Kalinga"/>
-        <a:font script="Mlym" typeface="Kartika"/>
-        <a:font script="Laoo" typeface="DokChampa"/>
-        <a:font script="Sinh" typeface="Iskoola Pota"/>
-        <a:font script="Mong" typeface="Mongolian Baiti"/>
-        <a:font script="Viet" typeface="Arial"/>
-        <a:font script="Uigh" typeface="Microsoft Uighur"/>
-        <a:font script="Geor" typeface="Sylfaen"/>
       </a:minorFont>
     </a:fontScheme>
-    <a:fmtScheme name="Office">
+    <a:fmtScheme>
       <a:fillStyleLst>
         <a:solidFill>
           <a:schemeClr val="phClr"/>
         </a:solidFill>
-        <a:gradFill rotWithShape="1">
+        <a:gradFill>
           <a:gsLst>
             <a:gs pos="0">
               <a:schemeClr val="phClr">
                 <a:lumMod val="110000"/>
-                <a:satMod val="105000"/>
                 <a:tint val="67000"/>
               </a:schemeClr>
             </a:gs>
             <a:gs pos="50000">
               <a:schemeClr val="phClr">
                 <a:lumMod val="105000"/>
-                <a:satMod val="103000"/>
                 <a:tint val="73000"/>
               </a:schemeClr>
             </a:gs>
             <a:gs pos="100000">
               <a:schemeClr val="phClr">
                 <a:lumMod val="105000"/>
-                <a:satMod val="109000"/>
                 <a:tint val="81000"/>
               </a:schemeClr>
             </a:gs>
           </a:gsLst>
           <a:lin ang="5400000" scaled="0"/>
+          <a:tileRect l="0" t="0" r="0" b="0"/>
         </a:gradFill>
-        <a:gradFill rotWithShape="1">
+        <a:gradFill>
           <a:gsLst>
             <a:gs pos="0">
               <a:schemeClr val="phClr">
-                <a:satMod val="103000"/>
                 <a:lumMod val="102000"/>
                 <a:tint val="94000"/>
               </a:schemeClr>
             </a:gs>
             <a:gs pos="50000">
               <a:schemeClr val="phClr">
-                <a:satMod val="110000"/>
                 <a:lumMod val="100000"/>
                 <a:shade val="100000"/>
               </a:schemeClr>
@@ -1085,33 +1644,24 @@
             <a:gs pos="100000">
               <a:schemeClr val="phClr">
                 <a:lumMod val="99000"/>
-                <a:satMod val="120000"/>
                 <a:shade val="78000"/>
               </a:schemeClr>
             </a:gs>
           </a:gsLst>
           <a:lin ang="5400000" scaled="0"/>
+          <a:tileRect l="0" t="0" r="0" b="0"/>
         </a:gradFill>
       </a:fillStyleLst>
       <a:lnStyleLst>
         <a:ln w="6350" cap="flat" cmpd="sng" algn="ctr">
-          <a:solidFill>
-            <a:schemeClr val="phClr"/>
-          </a:solidFill>
           <a:prstDash val="solid"/>
           <a:miter lim="800000"/>
         </a:ln>
         <a:ln w="12700" cap="flat" cmpd="sng" algn="ctr">
-          <a:solidFill>
-            <a:schemeClr val="phClr"/>
-          </a:solidFill>
           <a:prstDash val="solid"/>
           <a:miter lim="800000"/>
         </a:ln>
         <a:ln w="19050" cap="flat" cmpd="sng" algn="ctr">
-          <a:solidFill>
-            <a:schemeClr val="phClr"/>
-          </a:solidFill>
           <a:prstDash val="solid"/>
           <a:miter lim="800000"/>
         </a:ln>
@@ -1124,13 +1674,7 @@
           <a:effectLst/>
         </a:effectStyle>
         <a:effectStyle>
-          <a:effectLst>
-            <a:outerShdw blurRad="57150" dist="19050" dir="5400000" algn="ctr" rotWithShape="0">
-              <a:srgbClr val="000000">
-                <a:alpha val="63000"/>
-              </a:srgbClr>
-            </a:outerShdw>
-          </a:effectLst>
+          <a:effectLst/>
         </a:effectStyle>
       </a:effectStyleLst>
       <a:bgFillStyleLst>
@@ -1140,15 +1684,13 @@
         <a:solidFill>
           <a:schemeClr val="phClr">
             <a:tint val="95000"/>
-            <a:satMod val="170000"/>
           </a:schemeClr>
         </a:solidFill>
-        <a:gradFill rotWithShape="1">
+        <a:gradFill>
           <a:gsLst>
             <a:gs pos="0">
               <a:schemeClr val="phClr">
                 <a:tint val="93000"/>
-                <a:satMod val="150000"/>
                 <a:shade val="98000"/>
                 <a:lumMod val="102000"/>
               </a:schemeClr>
@@ -1156,7 +1698,6 @@
             <a:gs pos="50000">
               <a:schemeClr val="phClr">
                 <a:tint val="98000"/>
-                <a:satMod val="130000"/>
                 <a:shade val="90000"/>
                 <a:lumMod val="103000"/>
               </a:schemeClr>
@@ -1164,21 +1705,14 @@
             <a:gs pos="100000">
               <a:schemeClr val="phClr">
                 <a:shade val="63000"/>
-                <a:satMod val="120000"/>
               </a:schemeClr>
             </a:gs>
           </a:gsLst>
           <a:lin ang="5400000" scaled="0"/>
+          <a:tileRect l="0" t="0" r="0" b="0"/>
         </a:gradFill>
       </a:bgFillStyleLst>
     </a:fmtScheme>
   </a:themeElements>
-  <a:objectDefaults/>
-  <a:extraClrSchemeLst/>
-  <a:extLst>
-    <a:ext uri="{05A4C25C-085E-4340-85A3-A5531E510DB2}">
-      <thm15:themeFamily xmlns:thm15="http://schemas.microsoft.com/office/thememl/2012/main" name="Office Theme" id="{62F939B6-93AF-4DB8-9C6B-D6C7DFDC589F}" vid="{4A3C46E8-61CC-4603-A589-7422A47A8E4A}"/>
-    </a:ext>
-  </a:extLst>
 </a:theme>
 </file>
</xml_diff>